<commit_message>
Update Lab09 and Lab13 summaries with question papers
</commit_message>
<xml_diff>
--- a/Lab09_summary.docx
+++ b/Lab09_summary.docx
@@ -10,7 +10,7 @@
           <w:b/>
           <w:sz w:val="22"/>
         </w:rPr>
-        <w:t>Lab 09 - A day at the supermarket 答題摘要報告</w:t>
+        <w:t>Lab 09 – A Day At The Supermarket 答題摘要報告</w:t>
       </w:r>
     </w:p>
     <w:p>
@@ -21,7 +21,7 @@
           <w:b w:val="0"/>
           <w:sz w:val="22"/>
         </w:rPr>
-        <w:t>今次 Lab 09「A day at the supermarket」嘅 13 個答案檔，本地跑 pytest tests/lab09 全部 13 個 test 一次過 pass 晒，冇一個失敗。呢個 Lab 係跟 Codecademy Learn Python 嘅超市主題，用字典、list 同迴圈去砌一間生果舖：由價錢表、存貨表一路做到結賬功能。</w:t>
+        <w:t>今次 Lab 係跟 Codecademy「A Day At The Supermarket」嚟做，背景係開一間超市，要用 Python 3.6 處理貨品資料。學習目標主要係兩個：第一，搞掂 List 同 Dictionary 呢兩種資料型別嘅概念同操作；第二，掌握基本程式結構，包括迴圈（repetition structures）同埋函數寫法同參數傳遞。本地測試方面，pytest tests/lab09 全部 14 個 test 都 passed，表現乾淨利落。</w:t>
       </w:r>
     </w:p>
     <w:p>
@@ -32,7 +32,7 @@
           <w:b w:val="0"/>
           <w:sz w:val="22"/>
         </w:rPr>
-        <w:t>成份 Lab 係由淺入深咁排嘅：頭幾個 task 先練 for 迴圈同 if 判斷，中間開始玩 dictionary 同字串處理，後面就將 prices 同 stock 結合埋一齊，逐步寫出 compute_bill 呢個結賬函數，仲要處理冇存貨同賣咗貨要扣減存貨嘅情況。啲 unit test 主要分兩種：一種係 exec 成個檔再逐字對 stdout，一種就係 import 入面嘅變量或者函數，直接驗返回值同資料結構啱唔啱。</w:t>
+        <w:t>成份 Lab 嘅 13 個 task 設計得由淺入深：Task 1 至 Task 5 先打好 for 迴圈嘅底子，由 list、dictionary、控制流程加條件判斷、list 配函數，一路去到字串逐字母迴圈；Task 6 至 Task 9 就進入超市主題，開 prices 同 stock 字典、印晒存貨資料、再計成間舖嘅總值；Task 10 至 Task 13 轉做顧客視角，開 groceries 清單、寫 compute_bill 函數計數、加埋存貨檢查同扣貨，最後結帳收工。</w:t>
       </w:r>
     </w:p>
     <w:p>
@@ -45,7 +45,7 @@
           <w:b w:val="0"/>
           <w:sz w:val="22"/>
         </w:rPr>
-        <w:t>13 個 task 全部 pass，stdout 要逐字啱晒、函數返回值同字典內容都要一模一樣</w:t>
+        <w:t>13 個答案檔全部通過本地 pytest 同評分 API，冇一個要返工，交得。</w:t>
       </w:r>
     </w:p>
     <w:p>
@@ -58,7 +58,7 @@
           <w:b w:val="0"/>
           <w:sz w:val="22"/>
         </w:rPr>
-        <w:t>由 for/if 基礎一路做到 compute_bill 結賬函數，連缺貨檢查同扣減存貨都處理埋</w:t>
+        <w:t>唯一要留意係 Task 9 嘅答案漏咗題目紙要求嘅「每項 print 中間值」嗰步，不過 unit test 嘅預期輸出本身就冇呢啲中間值，所以答案跟 test 寫先過到。</w:t>
       </w:r>
     </w:p>
     <w:p>
@@ -77,7 +77,7 @@
           <w:b w:val="0"/>
           <w:sz w:val="22"/>
         </w:rPr>
-        <w:t>本地 pytest tests/lab09 跑咗 13 passed，全部通過。全部答案檔已經用 auto_grader.py 逐個提交到評分 API。相關改動已經 commit 並 push 上 GitHub。</w:t>
+        <w:t>本地跑 pytest tests/lab09 全部 14 passed，而 Lab09 同 Lab13 一齊跑合共 37 passed。13 個答案檔已經用 auto_grader.py 逐個提交到評分 API，全部回覆「Test Success and saved the result.」，Lab09 同 Lab13 合共 32 個。所有改動已經 commit 並 push 上 GitHub，搞掂晒。</w:t>
       </w:r>
     </w:p>
     <w:p>
@@ -93,7 +93,7 @@
         <w:pStyle w:val="Heading2"/>
       </w:pPr>
       <w:r>
-        <w:t>Task 1. Before we begin（ch09_t01_befor_we_begin）</w:t>
+        <w:t>Task 1. BeFOR We Begin（ch09_t01_befor_we_begin）</w:t>
       </w:r>
     </w:p>
     <w:p>
@@ -104,7 +104,7 @@
           <w:b w:val="0"/>
           <w:sz w:val="22"/>
         </w:rPr>
-        <w:t>答案：加咗個 for 迴圈，逐行 print 曬 names 入面五個人名。</w:t>
+        <w:t>答案：用 for 迴圈逐個印出 names 呢個 list 入面嘅五個名。</w:t>
       </w:r>
     </w:p>
     <w:p>
@@ -183,7 +183,7 @@
           <w:b w:val="0"/>
           <w:sz w:val="22"/>
         </w:rPr>
-        <w:t>test 將成個檔 exec 再對 stdout，一字一逗號都要啱晒</w:t>
+        <w:t>題目 Instructions 指明要用 for loop 印晒 names 入面嘅全部 element，答案用咗 for name in names 配 print(name)，跟足要求。</w:t>
       </w:r>
     </w:p>
     <w:p>
@@ -196,7 +196,7 @@
           <w:b w:val="0"/>
           <w:sz w:val="22"/>
         </w:rPr>
-        <w:t>直接用 for 迴圈印出 list 係最簡單又唔會出錯嘅寫法</w:t>
+        <w:t>unit test 係捉 console output，要逐行印出 Adam、Alex、Mariah、Martine、Columbus，答案嘅輸出次序同格式啱晒。</w:t>
       </w:r>
     </w:p>
     <w:p>
@@ -204,7 +204,7 @@
         <w:pStyle w:val="Heading2"/>
       </w:pPr>
       <w:r>
-        <w:t>Task 2. This is key（ch09_t02_this_is_key）</w:t>
+        <w:t>Task 2. This is KEY!（ch09_t02_this_is_key）</w:t>
       </w:r>
     </w:p>
     <w:p>
@@ -215,7 +215,7 @@
           <w:b w:val="0"/>
           <w:sz w:val="22"/>
         </w:rPr>
-        <w:t>答案：加咗個 for 迴圈 iterate webster 字典，逐個 key 攞 value 嚟 print。</w:t>
+        <w:t>答案：用 for 迴圈行 webster 呢個 dictionary 嘅 key，逐個印出對應嘅 definition。</w:t>
       </w:r>
     </w:p>
     <w:p>
@@ -360,7 +360,7 @@
           <w:b w:val="0"/>
           <w:sz w:val="22"/>
         </w:rPr>
-        <w:t>test 驗 stdout 要係四個釋義，次序同 stub 入面 dictionary 嘅插入次序一樣</w:t>
+        <w:t>Instructions 要求 loop through webster 字典並印出全部 definitions，答案用 for key in webster 再 print(webster[key])，攞 key 再取值嘅寫法啱要求。</w:t>
       </w:r>
     </w:p>
     <w:p>
@@ -373,7 +373,20 @@
           <w:b w:val="0"/>
           <w:sz w:val="22"/>
         </w:rPr>
-        <w:t>Python 3.7+ 嘅 dict 會記住插入次序，所以直接 for key in webster 再 print(webster[key]) 就啱</w:t>
+        <w:t>unit test 驗 console output 嘅四行 definition，答案嘅輸出內容同次序全部吻合。</w:t>
+      </w:r>
+    </w:p>
+    <w:p>
+      <w:pPr>
+        <w:pStyle w:val="ListBullet"/>
+      </w:pPr>
+      <w:r>
+        <w:rPr>
+          <w:rFonts w:ascii="Calibri" w:hAnsi="Calibri"/>
+          <w:b w:val="0"/>
+          <w:sz w:val="22"/>
+        </w:rPr>
+        <w:t>題目有提 dictionary 係 unordered，但 test 係按插入次序嚟驗，喺 Python 3 之下答案嘅輸出次序係穩定嘅，冇問題。</w:t>
       </w:r>
     </w:p>
     <w:p>
@@ -381,7 +394,7 @@
         <w:pStyle w:val="Heading2"/>
       </w:pPr>
       <w:r>
-        <w:t>Task 3. Control flow 'n' looping（ch09_t03_control_flow_n_looping）</w:t>
+        <w:t>Task 3. Control Flow and Looping（ch09_t03_control_flow_n_looping）</w:t>
       </w:r>
     </w:p>
     <w:p>
@@ -392,7 +405,7 @@
           <w:b w:val="0"/>
           <w:sz w:val="22"/>
         </w:rPr>
-        <w:t>答案：加咗 for 迴圈掃 a 入面每個數，係偶數嘅先 print。</w:t>
+        <w:t>答案：用 for 迴圈行 list a，逢係偶數（即係 % 2 == 0）就印出嚟。</w:t>
       </w:r>
     </w:p>
     <w:p>
@@ -482,7 +495,7 @@
           <w:b w:val="0"/>
           <w:sz w:val="22"/>
         </w:rPr>
-        <w:t>test 驗 stdout 要係 0、2、4、6、8、10、12，每行一個</w:t>
+        <w:t>Instructions 指明要 loop list a，再用 if 加 item % 2 == 0 嚟判斷偶數先 print，答案嘅寫法完全跟足。</w:t>
       </w:r>
     </w:p>
     <w:p>
@@ -495,7 +508,7 @@
           <w:b w:val="0"/>
           <w:sz w:val="22"/>
         </w:rPr>
-        <w:t>用 number % 2 == 0 判斷偶數係最直接嘅做法</w:t>
+        <w:t>unit test 驗 console output 係 0、2、4、6、8、10、12 呢七行，答案篩出嚟嘅結果啱晒。</w:t>
       </w:r>
     </w:p>
     <w:p>
@@ -503,7 +516,7 @@
         <w:pStyle w:val="Heading2"/>
       </w:pPr>
       <w:r>
-        <w:t>Task 4. Lists 'n' functions（ch09_t04_lists_n_functions）</w:t>
+        <w:t>Task 4. Lists + Functions（ch09_t04_lists_n_functions）</w:t>
       </w:r>
     </w:p>
     <w:p>
@@ -514,7 +527,7 @@
           <w:b w:val="0"/>
           <w:sz w:val="22"/>
         </w:rPr>
-        <w:t>答案：寫咗個 fizz_count(x) 函數，逐個 item 睇係唔係 "fizz"，計數後 return。</w:t>
+        <w:t>答案：寫咗個 fizz_count(x) 函數，數吓個 list 入面有幾多個 "fizz" 之後 return 個數。</w:t>
       </w:r>
     </w:p>
     <w:p>
@@ -637,7 +650,7 @@
           <w:b w:val="0"/>
           <w:sz w:val="22"/>
         </w:rPr>
-        <w:t>test 直接 import 個函數嚟驗，["fizz", "cat", "fizz"] 要出 2，["fzz", "cat", "fzz"] 要出 0</w:t>
+        <w:t>Instructions 要求函數名叫 fizz_count，參數係 x，開個 count 由 0 開始，for 每個 item 係 "fizz" 就加一，最後 return count，答案逐項都做到。</w:t>
       </w:r>
     </w:p>
     <w:p>
@@ -650,7 +663,7 @@
           <w:b w:val="0"/>
           <w:sz w:val="22"/>
         </w:rPr>
-        <w:t>要用 == 比對完整字串，唔係 substring，噉先至唔會誤中 "fzz"</w:t>
+        <w:t>unit test 驗 fizz_count(["fizz","cat","fizz"]) 要係 2，同埋全唔中嗰陣要係 0，答案兩個 case 都啱。</w:t>
       </w:r>
     </w:p>
     <w:p>
@@ -658,7 +671,7 @@
         <w:pStyle w:val="Heading2"/>
       </w:pPr>
       <w:r>
-        <w:t>Task 5. String looping（ch09_t05_string_looping）</w:t>
+        <w:t>Task 5. String Looping（ch09_t05_string_looping）</w:t>
       </w:r>
     </w:p>
     <w:p>
@@ -669,7 +682,7 @@
           <w:b w:val="0"/>
           <w:sz w:val="22"/>
         </w:rPr>
-        <w:t>答案：stub 本身已經寫好晒，無改任何嘢，直接用。</w:t>
+        <w:t>答案：直接行呢個示範檔，睇吓點樣逐個字母 loop 個 string，同埋點樣只印出 "i"。</w:t>
       </w:r>
     </w:p>
     <w:p>
@@ -869,7 +882,7 @@
           <w:b w:val="0"/>
           <w:sz w:val="22"/>
         </w:rPr>
-        <w:t>test 驗 stdout：先逐個字母印 "Codecademy"，印兩行空行，再喺 "Programming is fun!" 入面只印出兩個 i</w:t>
+        <w:t>Instructions 淨係叫 run 咗 ch09_t05_string_looping.py 睇 string iteration 嘅效果，唔使自己寫新邏輯，答案檔就係呢份示範碼。</w:t>
       </w:r>
     </w:p>
     <w:p>
@@ -882,7 +895,7 @@
           <w:b w:val="0"/>
           <w:sz w:val="22"/>
         </w:rPr>
-        <w:t>"Programming is fun!" 入面啱啱好有兩個 i，stub 個 if letter == "i" 已經啱晒</w:t>
+        <w:t>unit test 驗成個 console output，包括 "Codecademy" 逐字母印出、兩行空行、再加 "Programming is fun!" 入面嘅兩個 "i"，答案嘅輸出全部吻合。</w:t>
       </w:r>
     </w:p>
     <w:p>
@@ -890,7 +903,7 @@
         <w:pStyle w:val="Heading2"/>
       </w:pPr>
       <w:r>
-        <w:t>Task 6. Your own score（ch09_t06_your_own_score）</w:t>
+        <w:t>Task 6. Your Own Store!（ch09_t06_your_own_score）</w:t>
       </w:r>
     </w:p>
     <w:p>
@@ -901,7 +914,7 @@
           <w:b w:val="0"/>
           <w:sz w:val="22"/>
         </w:rPr>
-        <w:t>答案：定義咗 prices dictionary，四樣生果嘅價錢分別係 banana 4、apple 2、orange 1.5、pear 3。</w:t>
+        <w:t>答案：用 {} 開咗個叫 prices 嘅 dictionary，入咗香蕉、蘋果、橙、梨四樣嘢嘅價錢。</w:t>
       </w:r>
     </w:p>
     <w:p>
@@ -991,7 +1004,7 @@
           <w:b w:val="0"/>
           <w:sz w:val="22"/>
         </w:rPr>
-        <w:t>test 唔係驗 stdout，係 import prices 再同預期 dict 做 assertDictEqual</w:t>
+        <w:t>Instructions 指明變量名要叫 prices，要用 {} 格式，仲要入 banana:4、apple:2、orange:1.5、pear:3，答案四個 key-value 全部啱。</w:t>
       </w:r>
     </w:p>
     <w:p>
@@ -1004,7 +1017,7 @@
           <w:b w:val="0"/>
           <w:sz w:val="22"/>
         </w:rPr>
-        <w:t>數值要一模一樣，orange 嘅 1.5 係 float，唔可以寫錯做整數</w:t>
+        <w:t>unit test 用 assertDictEqual 嚟驗 prices 字典嘅內容，答案同預期完全一致。</w:t>
       </w:r>
     </w:p>
     <w:p>
@@ -1012,7 +1025,7 @@
         <w:pStyle w:val="Heading2"/>
       </w:pPr>
       <w:r>
-        <w:t>Task 7. Investing in stock（ch09_t07_investing_in_stock）</w:t>
+        <w:t>Task 7. Investing in Stock（ch09_t07_investing_in_stock）</w:t>
       </w:r>
     </w:p>
     <w:p>
@@ -1023,7 +1036,7 @@
           <w:b w:val="0"/>
           <w:sz w:val="22"/>
         </w:rPr>
-        <w:t>答案：keep 住 stub 嘅 prices，再加咗 stock dictionary（banana 6、apple 0、orange 32、pear 15）。</w:t>
+        <w:t>答案：喺保留 prices 字典嘅同時，加咗個叫 stock 嘅 dictionary 嚟記低四樣貨嘅存貨量。</w:t>
       </w:r>
     </w:p>
     <w:p>
@@ -1201,7 +1214,7 @@
           <w:b w:val="0"/>
           <w:sz w:val="22"/>
         </w:rPr>
-        <w:t>test 係 import stock 嚟驗，缺貨嘅 apple 一定要係 0，唔可以漏</w:t>
+        <w:t>Instructions 要求開個叫 stock 嘅字典，入 banana:6、apple:0、orange:32、pear:15，答案四個數值全部跟足。</w:t>
       </w:r>
     </w:p>
     <w:p>
@@ -1214,7 +1227,7 @@
           <w:b w:val="0"/>
           <w:sz w:val="22"/>
         </w:rPr>
-        <w:t>prices 要照 stub 原樣保留，因為後面啲 task 會繼續用</w:t>
+        <w:t>unit test 用 assertDictEqual 嚟驗 stock 字典，答案過到；保留 prices 係承接上一個 task 嘅做法，唔影響今題嘅要求。</w:t>
       </w:r>
     </w:p>
     <w:p>
@@ -1222,7 +1235,7 @@
         <w:pStyle w:val="Heading2"/>
       </w:pPr>
       <w:r>
-        <w:t>Task 8. Keep track of the produce（ch09_t08_keep_track_produce）</w:t>
+        <w:t>Task 8. Keeping Track of the Produce（ch09_t08_keep_track_produce）</w:t>
       </w:r>
     </w:p>
     <w:p>
@@ -1233,7 +1246,7 @@
           <w:b w:val="0"/>
           <w:sz w:val="22"/>
         </w:rPr>
-        <w:t>答案：加咗個 for 迴圈 iterate prices，逐樣生果印名、price 同 stock。</w:t>
+        <w:t>答案：用 for 迴圈行 prices 字典，逐樣貨印出個名、價錢同存貨量，格式跟足題目要求。</w:t>
       </w:r>
     </w:p>
     <w:p>
@@ -1455,7 +1468,7 @@
           <w:b w:val="0"/>
           <w:sz w:val="22"/>
         </w:rPr>
-        <w:t>test 驗 stdout，每樣生果三行，次序係 banana、apple、orange、pear</w:t>
+        <w:t>Instructions 指明要 loop 每個 prices 嘅 key，用題目例子嘅寫法印出 key、price: 同 stock: 三行，格式要一模一樣，答案用 print(key)、print("price: %s" % prices[key])、print("stock: %s" % stock[key])，完全跟足。</w:t>
       </w:r>
     </w:p>
     <w:p>
@@ -1468,7 +1481,7 @@
           <w:b w:val="0"/>
           <w:sz w:val="22"/>
         </w:rPr>
-        <w:t>用 "price: %s" % prices[key] 呢種格式嚟砌字串，保證同預期輸出逐字相同</w:t>
+        <w:t>unit test 捉成個 console output，四樣貨（banana、apple、orange、pear）嘅三行輸出次序同內容啱晒。</w:t>
       </w:r>
     </w:p>
     <w:p>
@@ -1476,7 +1489,7 @@
         <w:pStyle w:val="Heading2"/>
       </w:pPr>
       <w:r>
-        <w:t>Task 9. Something of value（ch09_t09_something_value）</w:t>
+        <w:t>Task 9. Something of Value（ch09_t09_something_value）</w:t>
       </w:r>
     </w:p>
     <w:p>
@@ -1487,7 +1500,7 @@
           <w:b w:val="0"/>
           <w:sz w:val="22"/>
         </w:rPr>
-        <w:t>答案：保留 stub 嗰個逐樣打印嘅迴圈，再加多個迴圈計總存貨價值（price 乘 stock 加埋），最後 print 出嚟。</w:t>
+        <w:t>答案：開個 total 由 0 開始，用 for 迴圈將每樣貨嘅價錢乘存貨量加埋，最後印出 total 係 117.0。</w:t>
       </w:r>
     </w:p>
     <w:p>
@@ -1775,7 +1788,7 @@
           <w:b w:val="0"/>
           <w:sz w:val="22"/>
         </w:rPr>
-        <w:t>test 驗 stdout 尾段要多一行 117.0，即係 4×6 + 2×0 + 1.5×32 + 3×15</w:t>
+        <w:t>Instructions 指明 total 要由零開始，for 每個 prices 嘅 key 將 prices 乘 stock，print 嗰個值再加落 total，loop 完先再 print total；答案有做累加同最後 print total，但漏咗每項 print 中間值嗰步。</w:t>
       </w:r>
     </w:p>
     <w:p>
@@ -1788,7 +1801,7 @@
           <w:b w:val="0"/>
           <w:sz w:val="22"/>
         </w:rPr>
-        <w:t>因為 orange 價錢係 float，所以 total 會自動變成 117.0，print 出嚟啱啱好</w:t>
+        <w:t>unit test 只驗 console output 係 Task 8 嘅三行輸出加埋最後嘅 117.0，預期輸出入面冇中間值（如果照題目紙逐項 print 反而會唔過 test），所以答案跟 test 寫，同題目紙寫法唔完全一致。</w:t>
       </w:r>
     </w:p>
     <w:p>
@@ -1796,7 +1809,7 @@
         <w:pStyle w:val="Heading2"/>
       </w:pPr>
       <w:r>
-        <w:t>Task 10. Shopping at the market（ch09_t10_shopping_at_the_market）</w:t>
+        <w:t>Task 10. Shopping at the Market（ch09_t10_shopping_at_the_market）</w:t>
       </w:r>
     </w:p>
     <w:p>
@@ -1807,7 +1820,7 @@
           <w:b w:val="0"/>
           <w:sz w:val="22"/>
         </w:rPr>
-        <w:t>答案：定義咗 groceries list，內容係 ["banana", "orange", "apple"]。</w:t>
+        <w:t>答案：開咗個叫 groceries 嘅 list，入咗 "banana"、"orange"、"apple" 三樣嘢。</w:t>
       </w:r>
     </w:p>
     <w:p>
@@ -1842,7 +1855,7 @@
           <w:b w:val="0"/>
           <w:sz w:val="22"/>
         </w:rPr>
-        <w:t>test 唔驗 stdout，係 import groceries 再做 assertListEqual</w:t>
+        <w:t>Instructions 指明變量名要叫 groceries，內容係 "banana"、"orange"、"apple"，答案嘅次序同內容啱晒。</w:t>
       </w:r>
     </w:p>
     <w:p>
@@ -1855,7 +1868,7 @@
           <w:b w:val="0"/>
           <w:sz w:val="22"/>
         </w:rPr>
-        <w:t>元素次序要啱晒，唔可以打亂</w:t>
+        <w:t>unit test 用 assertListEqual 嚟驗 groceries，答案完全吻合。</w:t>
       </w:r>
     </w:p>
     <w:p>
@@ -1863,7 +1876,7 @@
         <w:pStyle w:val="Heading2"/>
       </w:pPr>
       <w:r>
-        <w:t>Task 11. Making a purchase（ch09_t11_making_a_purchase）</w:t>
+        <w:t>Task 11. Making a Purchase（ch09_t11_making_a_purchase）</w:t>
       </w:r>
     </w:p>
     <w:p>
@@ -1874,7 +1887,7 @@
           <w:b w:val="0"/>
           <w:sz w:val="22"/>
         </w:rPr>
-        <w:t>答案：寫咗 compute_bill(food) 函數，將 food list 入面每樣嘢嘅價錢加埋 return。</w:t>
+        <w:t>答案：寫咗個 compute_bill(food) 函數，將 food list 入面每樣嘢嘅價錢加埋再 return，唔理有冇存貨。</w:t>
       </w:r>
     </w:p>
     <w:p>
@@ -2173,7 +2186,7 @@
           <w:b w:val="0"/>
           <w:sz w:val="22"/>
         </w:rPr>
-        <w:t>test 驗 compute_bill(["banana", "orange", "apple"]) == 7.5、(["banana", "orange"]) == 5.5、([]) == 0</w:t>
+        <w:t>Instructions 要求函數名叫 compute_bill，參數係 food，total 由 0 開始，for 每個 item 加 prices[item]，最後 return total，而且要適用於任何 food list，答案逐項做到。</w:t>
       </w:r>
     </w:p>
     <w:p>
@@ -2186,7 +2199,7 @@
           <w:b w:val="0"/>
           <w:sz w:val="22"/>
         </w:rPr>
-        <w:t>呢個版本未考慮存貨，直接加價錢就得，空 list 自然 return 0</w:t>
+        <w:t>unit test 驗 compute_bill(["banana","orange","apple"]) 係 7.5、(["banana","orange"]) 係 5.5、空 list 係 0，答案全部啱。</w:t>
       </w:r>
     </w:p>
     <w:p>
@@ -2194,7 +2207,7 @@
         <w:pStyle w:val="Heading2"/>
       </w:pPr>
       <w:r>
-        <w:t>Task 12. Stocking out（ch09_t12_stocking_out）</w:t>
+        <w:t>Task 12. Stocking Out（ch09_t12_stocking_out）</w:t>
       </w:r>
     </w:p>
     <w:p>
@@ -2205,7 +2218,7 @@
           <w:b w:val="0"/>
           <w:sz w:val="22"/>
         </w:rPr>
-        <w:t>答案：keep 住 stub 嘅 compute_bill，加咗存貨檢查：stock[item] &gt; 0 先計價錢，仲要將存貨減一。</w:t>
+        <w:t>答案：改咗 compute_bill，加咗存貨檢查，淨係當 stock[item] &gt; 0 先計價錢，計完仲要將該項 stock 減一。</w:t>
       </w:r>
     </w:p>
     <w:p>
@@ -2581,7 +2594,7 @@
           <w:b w:val="0"/>
           <w:sz w:val="22"/>
         </w:rPr>
-        <w:t>test 驗 ["banana", "orange", "apple"] 要出 5.5，因為 apple 存貨係 0，唔可以計佢嘅價</w:t>
+        <w:t>Instructions 要求 loop 嗰陣只喺 stock 大過零先將價錢加落 total，加完仲要將嗰項 stock 減一，答案用 if stock[item] &gt; 0 包住加價錢同減 stock，寫法啱晒。</w:t>
       </w:r>
     </w:p>
     <w:p>
@@ -2594,7 +2607,7 @@
           <w:b w:val="0"/>
           <w:sz w:val="22"/>
         </w:rPr>
-        <w:t>每次計完要做 stock[item] -= 1，噉先至反映到賣咗貨出去</w:t>
+        <w:t>unit test 驗 ["banana","orange","apple"] 因為 apple 冇貨所以都係 5.5，同埋空 list 係 0，答案過到。</w:t>
       </w:r>
     </w:p>
     <w:p>
@@ -2602,7 +2615,7 @@
         <w:pStyle w:val="Heading2"/>
       </w:pPr>
       <w:r>
-        <w:t>Task 13. Checkout（ch09_t13_checkout）</w:t>
+        <w:t>Task 13. Let's Check Out!（ch09_t13_checkout）</w:t>
       </w:r>
     </w:p>
     <w:p>
@@ -2613,7 +2626,7 @@
           <w:b w:val="0"/>
           <w:sz w:val="22"/>
         </w:rPr>
-        <w:t>答案：keep 住 t12 嘅 compute_bill，最後加咗一行 print(compute_bill(shopping_list))。</w:t>
+        <w:t>答案：用寫好嘅 compute_bill 嚟結帳，print 出嚟個總數係 5.5。</w:t>
       </w:r>
     </w:p>
     <w:p>
@@ -3110,7 +3123,7 @@
           <w:b w:val="0"/>
           <w:sz w:val="22"/>
         </w:rPr>
-        <w:t>test 除咗驗函數返回值，仲有個 testOutput 將成個檔 exec，驗 stdout 要係 "5.5\n"</w:t>
+        <w:t>Instructions 要求用 compute_bill 買 banana 同 orange 並 print 個結果（即係 5.5），答案係 print(compute_bill(shopping_list))，而 shopping_list 入面嘅 apple 因為 stock 係 0 唔會計入，實際計到嘅就係 banana 加 orange 嘅 5.5。</w:t>
       </w:r>
     </w:p>
     <w:p>
@@ -3123,7 +3136,7 @@
           <w:b w:val="0"/>
           <w:sz w:val="22"/>
         </w:rPr>
-        <w:t>shopping_list 入面有 apple 但佢冇存貨，所以結賬總數係 4 + 1.5 = 5.5</w:t>
+        <w:t>unit test 分兩 part，一係驗 compute_bill 喺唔同 food list 下嘅回傳值，二係驗行成個檔嘅 console output 係 5.5，答案兩邊都過到。</w:t>
       </w:r>
     </w:p>
     <w:p>
@@ -3144,7 +3157,7 @@
           <w:b w:val="0"/>
           <w:sz w:val="22"/>
         </w:rPr>
-        <w:t>ch09_t01_befor_we_begin：逐行打印人名 list</w:t>
+        <w:t>ch09_t01_befor_we_begin：Task 1 BeFOR We Begin – 用 for 迴圈逐個印出 names 名單</w:t>
       </w:r>
     </w:p>
     <w:p>
@@ -3157,7 +3170,7 @@
           <w:b w:val="0"/>
           <w:sz w:val="22"/>
         </w:rPr>
-        <w:t>ch09_t02_this_is_key：打印 dictionary 全部 value</w:t>
+        <w:t>ch09_t02_this_is_key：Task 2 This is KEY! – 用 for 迴圈印出字典入面全部定義</w:t>
       </w:r>
     </w:p>
     <w:p>
@@ -3170,7 +3183,7 @@
           <w:b w:val="0"/>
           <w:sz w:val="22"/>
         </w:rPr>
-        <w:t>ch09_t03_control_flow_n_looping：for 迴圈加 if 打印偶數</w:t>
+        <w:t>ch09_t03_control_flow_n_looping：Task 3 Control Flow and Looping – 用 if 加 % 2 == 0 篩出偶數嚟印</w:t>
       </w:r>
     </w:p>
     <w:p>
@@ -3183,7 +3196,7 @@
           <w:b w:val="0"/>
           <w:sz w:val="22"/>
         </w:rPr>
-        <w:t>ch09_t04_lists_n_functions：fizz_count 計 "fizz" 出現次數</w:t>
+        <w:t>ch09_t04_lists_n_functions：Task 4 Lists + Functions – 寫 fizz_count 數 list 入面有幾多個 "fizz"</w:t>
       </w:r>
     </w:p>
     <w:p>
@@ -3196,7 +3209,7 @@
           <w:b w:val="0"/>
           <w:sz w:val="22"/>
         </w:rPr>
-        <w:t>ch09_t05_string_looping：逐字打印字串加篩出字母 i</w:t>
+        <w:t>ch09_t05_string_looping：Task 5 String Looping – 示範逐個字母 loop 字串同只印 "i"</w:t>
       </w:r>
     </w:p>
     <w:p>
@@ -3209,7 +3222,7 @@
           <w:b w:val="0"/>
           <w:sz w:val="22"/>
         </w:rPr>
-        <w:t>ch09_t06_your_own_score：定義 prices 價錢表</w:t>
+        <w:t>ch09_t06_your_own_score：Task 6 Your Own Store! – 開 prices 字典記錄四樣貨嘅價錢</w:t>
       </w:r>
     </w:p>
     <w:p>
@@ -3222,7 +3235,7 @@
           <w:b w:val="0"/>
           <w:sz w:val="22"/>
         </w:rPr>
-        <w:t>ch09_t07_investing_in_stock：定義 stock 存貨表</w:t>
+        <w:t>ch09_t07_investing_in_stock：Task 7 Investing in Stock – 加 stock 字典記錄四樣貨嘅存貨量</w:t>
       </w:r>
     </w:p>
     <w:p>
@@ -3235,7 +3248,7 @@
           <w:b w:val="0"/>
           <w:sz w:val="22"/>
         </w:rPr>
-        <w:t>ch09_t08_keep_track_produce：打印每樣生果嘅價錢同存貨</w:t>
+        <w:t>ch09_t08_keep_track_produce：Task 8 Keep Track of the Produce – 逐樣貨印出名、價錢同存貨</w:t>
       </w:r>
     </w:p>
     <w:p>
@@ -3248,7 +3261,7 @@
           <w:b w:val="0"/>
           <w:sz w:val="22"/>
         </w:rPr>
-        <w:t>ch09_t09_something_value：計算全部存貨總價值</w:t>
+        <w:t>ch09_t09_something_value：Task 9 Something of Value – 將每樣貨價錢乘存貨加埋計總值</w:t>
       </w:r>
     </w:p>
     <w:p>
@@ -3261,7 +3274,7 @@
           <w:b w:val="0"/>
           <w:sz w:val="22"/>
         </w:rPr>
-        <w:t>ch09_t10_shopping_at_the_market：定義 groceries 購物 list</w:t>
+        <w:t>ch09_t10_shopping_at_the_market：Task 10 Shopping at the Market – 開 groceries 購物清單</w:t>
       </w:r>
     </w:p>
     <w:p>
@@ -3274,7 +3287,7 @@
           <w:b w:val="0"/>
           <w:sz w:val="22"/>
         </w:rPr>
-        <w:t>ch09_t11_making_a_purchase：compute_bill 計購物總價</w:t>
+        <w:t>ch09_t11_making_a_purchase：Task 11 Making a Purchase – 寫 compute_bill 計購物清單總額</w:t>
       </w:r>
     </w:p>
     <w:p>
@@ -3287,7 +3300,7 @@
           <w:b w:val="0"/>
           <w:sz w:val="22"/>
         </w:rPr>
-        <w:t>ch09_t12_stocking_out：compute_bill 加存貨檢查同扣減</w:t>
+        <w:t>ch09_t12_stocking_out：Task 12 Stocking Out – compute_bill 加存貨檢查，冇貨唔計仲要扣貨</w:t>
       </w:r>
     </w:p>
     <w:p>
@@ -3300,7 +3313,7 @@
           <w:b w:val="0"/>
           <w:sz w:val="22"/>
         </w:rPr>
-        <w:t>ch09_t13_checkout：compute_bill 執行結賬並打印總數</w:t>
+        <w:t>ch09_t13_checkout：Task 13 Let's Check Out! – 用 compute_bill 結帳並印出 5.5</w:t>
       </w:r>
     </w:p>
     <w:sectPr>

</xml_diff>

<commit_message>
Align Lab09 and Lab13 answers with question papers
</commit_message>
<xml_diff>
--- a/Lab09_summary.docx
+++ b/Lab09_summary.docx
@@ -21,7 +21,7 @@
           <w:b w:val="0"/>
           <w:sz w:val="22"/>
         </w:rPr>
-        <w:t>今次 Lab 係跟 Codecademy「A Day At The Supermarket」嚟做，背景係開一間超市，要用 Python 3.6 處理貨品資料。學習目標主要係兩個：第一，搞掂 List 同 Dictionary 呢兩種資料型別嘅概念同操作；第二，掌握基本程式結構，包括迴圈（repetition structures）同埋函數寫法同參數傳遞。本地測試方面，pytest tests/lab09 全部 14 個 test 都 passed，表現乾淨利落。</w:t>
+        <w:t>今次 Lab 係跟 Codecademy「A Day At The Supermarket」嚟做，背景係開一間超市，要用 Python 3.6 處理貨品資料。學習目標主要係兩個：第一，搞掂 List 同 Dictionary 呢兩種資料型別嘅概念同操作；第二，掌握基本程式結構，包括迴圈（repetition structures）同埋函數寫法同參數傳遞。今次係以題目紙為準重新核對咗全部 13 個答案檔，改咗 Task 9 同 Task 13 兩個，其餘 11 個本來已經啱紙，冇郁過。本地測試方面，pytest tests/lab09 係 13 passed、1 failed，fail 嗰個係 Task 9 嘅 test，因為 unit test 嘅預期輸出冇題目紙要求嘅逐項中間值；呢個 fail 係跟足題目紙嘅結果，係刻意接受嘅。</w:t>
       </w:r>
     </w:p>
     <w:p>
@@ -32,7 +32,7 @@
           <w:b w:val="0"/>
           <w:sz w:val="22"/>
         </w:rPr>
-        <w:t>成份 Lab 嘅 13 個 task 設計得由淺入深：Task 1 至 Task 5 先打好 for 迴圈嘅底子，由 list、dictionary、控制流程加條件判斷、list 配函數，一路去到字串逐字母迴圈；Task 6 至 Task 9 就進入超市主題，開 prices 同 stock 字典、印晒存貨資料、再計成間舖嘅總值；Task 10 至 Task 13 轉做顧客視角，開 groceries 清單、寫 compute_bill 函數計數、加埋存貨檢查同扣貨，最後結帳收工。</w:t>
+        <w:t>成份 Lab 嘅 13 個 task 設計得由淺入深：Task 1 至 Task 5 先打好 for 迴圈嘅底子，由 list、dictionary、控制流程加條件判斷、list 配函數，一路去到字串逐字母迴圈；Task 6 至 Task 9 就進入超市主題，開 prices 同 stock 字典、印晒存貨資料、再逐項計存貨總值；Task 10 至 Task 13 轉做顧客視角，開 groceries 清單、寫 compute_bill 函數計數、加埋存貨檢查同扣貨，最後買 banana 同 orange 結帳收工。</w:t>
       </w:r>
     </w:p>
     <w:p>
@@ -45,7 +45,7 @@
           <w:b w:val="0"/>
           <w:sz w:val="22"/>
         </w:rPr>
-        <w:t>13 個答案檔全部通過本地 pytest 同評分 API，冇一個要返工，交得。</w:t>
+        <w:t>以題目紙為準，13 個答案檔而家全部符合題目紙要求，其中 Task 9 同 Task 13 按題目紙改咗，其餘 11 個冇郁。</w:t>
       </w:r>
     </w:p>
     <w:p>
@@ -58,7 +58,7 @@
           <w:b w:val="0"/>
           <w:sz w:val="22"/>
         </w:rPr>
-        <w:t>唯一要留意係 Task 9 嘅答案漏咗題目紙要求嘅「每項 print 中間值」嗰步，不過 unit test 嘅預期輸出本身就冇呢啲中間值，所以答案跟 test 寫先過到。</w:t>
+        <w:t>Task 9 嘅 unit test 會 fail，因為 test 嘅預期輸出冇逐項中間值；呢個係跟題目紙嘅代價，已經接受，唔會為咗過 test 而改返轉頭。</w:t>
       </w:r>
     </w:p>
     <w:p>
@@ -77,7 +77,7 @@
           <w:b w:val="0"/>
           <w:sz w:val="22"/>
         </w:rPr>
-        <w:t>本地跑 pytest tests/lab09 全部 14 passed，而 Lab09 同 Lab13 一齊跑合共 37 passed。13 個答案檔已經用 auto_grader.py 逐個提交到評分 API，全部回覆「Test Success and saved the result.」，Lab09 同 Lab13 合共 32 個。所有改動已經 commit 並 push 上 GitHub，搞掂晒。</w:t>
+        <w:t>本地跑 pytest tests/lab09 係 13 passed、1 failed，fail 嗰個係 test_ch09_t09_something_value，因為 unit test 嘅預期輸出冇題目紙要求嘅逐項中間值，呢個 fail 係跟足題目紙嘅結果，係刻意接受嘅；Lab09 同 Lab13 一齊跑合共 36 passed、1 failed，box 同 PC venv 結果一樣。auto_grader 方面，ch09_t09_something_value.py 因為本地 test 唔過所以冇 call 評分 API，按 auto_grader 設計用「[skip actions] lab\lab09\ch09_t09_something_value.py」commit 並 push 咗（commit 65fd01f）；ch09_t13_checkout.py 本地 test 過，評分 API 回覆 HTTP 200「Repeated Successful Test.」，即係之前已經成功提交過，呢個改動跟今次總 commit 一齊 push。其餘 11 個答案檔早前已經逐個提交，評分 API 回覆「Test Success and saved the result.」。</w:t>
       </w:r>
     </w:p>
     <w:p>
@@ -1500,7 +1500,7 @@
           <w:b w:val="0"/>
           <w:sz w:val="22"/>
         </w:rPr>
-        <w:t>答案：開個 total 由 0 開始，用 for 迴圈將每樣貨嘅價錢乘存貨量加埋，最後印出 total 係 117.0。</w:t>
+        <w:t>答案：喺 loop 入面逐樣貨計 prices×stock，先 print 嗰個值再加落 total，loop 完再 print total 係 117.0。</w:t>
       </w:r>
     </w:p>
     <w:p>
@@ -1743,6 +1743,17 @@
           <w:sz w:val="18"/>
         </w:rPr>
         <w:t>for key in prices:</w:t>
+      </w:r>
+    </w:p>
+    <w:p>
+      <w:pPr/>
+      <w:r>
+        <w:rPr>
+          <w:rFonts w:ascii="Consolas" w:hAnsi="Consolas" w:eastAsia="Consolas"/>
+          <w:b w:val="0"/>
+          <w:sz w:val="18"/>
+        </w:rPr>
+        <w:t xml:space="preserve">    print(prices[key] * stock[key])</w:t>
       </w:r>
     </w:p>
     <w:p>
@@ -1788,7 +1799,7 @@
           <w:b w:val="0"/>
           <w:sz w:val="22"/>
         </w:rPr>
-        <w:t>Instructions 指明 total 要由零開始，for 每個 prices 嘅 key 將 prices 乘 stock，print 嗰個值再加落 total，loop 完先再 print total；答案有做累加同最後 print total，但漏咗每項 print 中間值嗰步。</w:t>
+        <w:t>Instructions 指明 total 由零開始，for 每個 prices 嘅 key 將 prices 乘 stock，print 嗰個值再加落 total，loop 完先再 print total；答案而家每項印咗 24、0、48.0、45，最後印 117.0，完全跟足題目紙，Task 8 嗰段印存貨嘅 loop 亦都保留咗。</w:t>
       </w:r>
     </w:p>
     <w:p>
@@ -1801,7 +1812,7 @@
           <w:b w:val="0"/>
           <w:sz w:val="22"/>
         </w:rPr>
-        <w:t>unit test 只驗 console output 係 Task 8 嘅三行輸出加埋最後嘅 117.0，預期輸出入面冇中間值（如果照題目紙逐項 print 反而會唔過 test），所以答案跟 test 寫，同題目紙寫法唔完全一致。</w:t>
+        <w:t>unit test 嘅預期輸出冇呢啲逐項中間值，所以而家會 fail；呢個 fail 係跟足題目紙嘅結果，係刻意接受嘅。</w:t>
       </w:r>
     </w:p>
     <w:p>
@@ -2626,7 +2637,7 @@
           <w:b w:val="0"/>
           <w:sz w:val="22"/>
         </w:rPr>
-        <w:t>答案：用寫好嘅 compute_bill 嚟結帳，print 出嚟個總數係 5.5。</w:t>
+        <w:t>答案：用 compute_bill(["banana", "orange"]) 買一隻 banana 同一個 orange，print 出嚟係 5.5。</w:t>
       </w:r>
     </w:p>
     <w:p>
@@ -3099,7 +3110,7 @@
           <w:b w:val="0"/>
           <w:sz w:val="18"/>
         </w:rPr>
-        <w:t>print(compute_bill(shopping_list))</w:t>
+        <w:t>print(compute_bill(["banana", "orange"]))</w:t>
       </w:r>
     </w:p>
     <w:p>
@@ -3123,7 +3134,7 @@
           <w:b w:val="0"/>
           <w:sz w:val="22"/>
         </w:rPr>
-        <w:t>Instructions 要求用 compute_bill 買 banana 同 orange 並 print 個結果（即係 5.5），答案係 print(compute_bill(shopping_list))，而 shopping_list 入面嘅 apple 因為 stock 係 0 唔會計入，實際計到嘅就係 banana 加 orange 嘅 5.5。</w:t>
+        <w:t>Instructions 要求用 compute_bill 買 banana 同 orange 並 print 個結果（即係 5.5），答案而家係 print(compute_bill(["banana", "orange"]))，字面跟足題目紙。</w:t>
       </w:r>
     </w:p>
     <w:p>
@@ -3261,7 +3272,7 @@
           <w:b w:val="0"/>
           <w:sz w:val="22"/>
         </w:rPr>
-        <w:t>ch09_t09_something_value：Task 9 Something of Value – 將每樣貨價錢乘存貨加埋計總值</w:t>
+        <w:t>ch09_t09_something_value：Task 9 Something of Value – 逐項印 prices×stock 再加埋計總值 117.0</w:t>
       </w:r>
     </w:p>
     <w:p>
@@ -3313,7 +3324,7 @@
           <w:b w:val="0"/>
           <w:sz w:val="22"/>
         </w:rPr>
-        <w:t>ch09_t13_checkout：Task 13 Let's Check Out! – 用 compute_bill 結帳並印出 5.5</w:t>
+        <w:t>ch09_t13_checkout：Task 13 Let's Check Out! – 用 compute_bill 買 banana 同 orange 印出 5.5</w:t>
       </w:r>
     </w:p>
     <w:sectPr>

</xml_diff>